<commit_message>
Actualiza dashboard final de fase 3
</commit_message>
<xml_diff>
--- a/reports/Fase3_BI_Informe.docx
+++ b/reports/Fase3_BI_Informe.docx
@@ -338,7 +338,7 @@
           <w:sz w:val="22"/>
           <w:szCs w:val="22"/>
         </w:rPr>
-        <w:t xml:space="preserve">Materializar el dashboard en Power BI, en el archivo DASHBOARD.pbix, con filtros, KPIs y visualizaciones listas para sustentacion.</w:t>
+        <w:t xml:space="preserve">Materializar el dashboard en Power BI, en el archivo DASHBOARD ZIUVAR.pbix, con filtros, KPIs y visualizaciones listas para sustentacion.</w:t>
       </w:r>
     </w:p>
     <w:p>
@@ -3501,7 +3501,7 @@
           <w:sz w:val="22"/>
           <w:szCs w:val="22"/>
         </w:rPr>
-        <w:t xml:space="preserve">Esta vista responde a la pregunta más intuitiva del análisis: ¿usar más IA produce mejor rendimiento? La evidencia muestra que no. El grupo de uso Medio (5–15 h/sem) obtiene el mayor cambio promedio de GPA (+0,227), por encima tanto del uso Bajo (+0,195) como del uso Alto (+0,173). Existe un punto óptimo y traspasarlo destruye valor académico.</w:t>
+        <w:t xml:space="preserve">Esta vista responde a la pregunta más intuitiva del análisis: ¿usar más IA produce mejor rendimiento? La evidencia muestra que no. El grupo de uso Medio (5–15 h/sem) obtiene el mayor cambio promedio de GPA (+0,227), por encima tanto del uso Bajo (+0,195) como del uso Alto (+0,173). Existe un punto óptimo y excederlo reduce el valor académico.</w:t>
       </w:r>
     </w:p>
     <w:p>
@@ -3578,7 +3578,7 @@
           <w:sz w:val="22"/>
           <w:szCs w:val="22"/>
         </w:rPr>
-        <w:t xml:space="preserve">La curva de retención cae de forma continua a medida que sube la dependencia percibida: de 76,5 puntos (dependencia 2) a 63,5 puntos (dependencia 10), una pérdida de 12,5 puntos absolutos que equivale al 16% relativo. Es la relación más nítida del dataset y un argumento contundente para no fomentar el uso acrítico.</w:t>
+        <w:t xml:space="preserve">La curva de retención cae de forma continua a medida que sube la dependencia percibida: de 76,5 puntos (dependencia 2) a 63,5 puntos (dependencia 10), una pérdida de 12,5 puntos absolutos que equivale al 16% relativo. Es la relación clara del dataset y respalda la recomendación de evitar el uso acrítico.</w:t>
       </w:r>
     </w:p>
     <w:p>
@@ -4228,7 +4228,7 @@
           <w:sz w:val="26"/>
           <w:szCs w:val="26"/>
         </w:rPr>
-        <w:t xml:space="preserve">Insight 2 — La dependencia destruye retención</w:t>
+        <w:t xml:space="preserve">Insight 2 — La dependencia reduce la retención</w:t>
       </w:r>
     </w:p>
     <w:p>
@@ -4474,7 +4474,7 @@
           <w:sz w:val="22"/>
           <w:szCs w:val="22"/>
         </w:rPr>
-        <w:t xml:space="preserve">powerbi/DASHBOARD.pbix — dashboard interactivo construido en Power BI, listo para la sustentacion.</w:t>
+        <w:t xml:space="preserve">powerbi/DASHBOARD ZIUVAR.pbix — dashboard interactivo construido en Power BI, listo para la sustentacion.</w:t>
       </w:r>
     </w:p>
     <w:p>
@@ -4537,7 +4537,7 @@
           <w:sz w:val="22"/>
           <w:szCs w:val="22"/>
         </w:rPr>
-        <w:t xml:space="preserve">Los hallazgos no son banales: confirman que la relación entre uso de IA y rendimiento académico es no lineal, que la dependencia destruye retención de forma medible, que el burnout y el uso intensivo se mueven juntos, y que las políticas de prohibición no producen el efecto que pretenden. Cualquier institución que tome decisiones sobre regulación o formación en IA basándose en intuición tiene en estos cinco insights un punto de partida más sólido que el debate público actual.</w:t>
+        <w:t xml:space="preserve">Los hallazgos principales confirman que la relación entre uso de IA y rendimiento académico es no lineal, que la dependencia reduce la retención de forma medible, que el burnout y el uso intensivo se mueven juntos, y que las políticas de prohibición no producen el efecto que pretenden. Cualquier institución que tome decisiones sobre regulación o formación en IA basándose en intuición tiene en estos cinco insights un punto de partida más sólido que el debate público actual.</w:t>
       </w:r>
     </w:p>
     <w:p>

</xml_diff>